<commit_message>
carbonara con clara: añade micro-ajuste de pimentón/cúrcuma para dar color a la microtortilla
</commit_message>
<xml_diff>
--- a/recetas/carbonara-con-clara.docx
+++ b/recetas/carbonara-con-clara.docx
@@ -306,7 +306,7 @@
           </w:tcPr>
           <w:p>
             <w:r>
-              <w:t>Sal</w:t>
+              <w:t>Pimentón dulce o cúrcuma (opcional, para color)</w:t>
             </w:r>
           </w:p>
         </w:tc>
@@ -366,7 +366,7 @@
     </w:p>
     <w:p>
       <w:r>
-        <w:t>Separa 1 huevo entero y 1 yema adicional. Reserva la clara sobrante para la microtortilla. En un bol, bate el huevo entero y la yema con un tenedor. Añade 3-4 cucharadas de queso en polvo y pimienta negra generosa (al menos 10 vueltas de molinillo). Bate hasta integrar. La mezcla quedará espesa — no pasa nada, el agua de cocción la fluidificará.</w:t>
+        <w:t>Separa 1 huevo entero y 1 yema adicional. Reserva la clara sobrante para la microtortilla. En un bol, bate el huevo entero y la yema con un tenedor. Añade 3-4 cucharadas de queso en polvo y pimienta negra generosa. Bate hasta integrar. La mezcla quedará espesa — no pasa nada, el agua de cocción la fluidificará.</w:t>
       </w:r>
     </w:p>
     <w:p>
@@ -392,7 +392,7 @@
     </w:p>
     <w:p>
       <w:r>
-        <w:t>Vuelve a encender el fuego de la sartén 30 segundos para calentar la grasa, luego apágalo. Echa la pasta caliente escurrida en la sartén con el bacon y mezcla. Retira la sartén del fuego (si es vitrocerámica, apártala de la placa). Vierte la mezcla de huevo y queso sobre la pasta y remueve enérgicamente 30-60 segundos. El calor residual de la pasta cocinará el huevo. Añade agua de cocción de cucharada en cucharada (empieza con 2 cdas) mientras sigues removiendo, hasta obtener una salsa cremosa que recubra la pasta. Si ves que el queso en polvo no emulsiona bien, añade la nuez de mantequilla y mezcla hasta fundir. Prueba y ajusta de sal y pimienta.</w:t>
+        <w:t>Vuelve a encender el fuego de la sartén 30 segundos para calentar la grasa, luego apágalo. Echa la pasta caliente escurrida en la sartén con el bacon y mezcla. Retira la sartén del fuego. Vierte la mezcla de huevo y queso sobre la pasta y remueve enérgicamente 30-60 segundos. Añade agua de cocción de cucharada en cucharada hasta obtener una salsa cremosa. Si el queso en polvo no emulsiona bien, añade la nuez de mantequilla y mezcla hasta fundir. Prueba y ajusta.</w:t>
       </w:r>
     </w:p>
     <w:p>
@@ -418,7 +418,7 @@
     </w:p>
     <w:p>
       <w:r>
-        <w:t>Mientras la pasta reposa 1 minuto antes de servir: Pon la clara reservada en un bol apto para microondas ligeramente engrasado. Añade 1 cda de agua o leche. Bate con un tenedor hasta que espume ligeramente. Añade sal, pimienta y queso en polvo (opcional) y mezcla. Microondas 30 segundos a potencia media-alta. Si aún está líquida, añade 10 segundos más. Ve de 10 en 10 — en 1 minuto seguido se pasa y queda chiclosa.</w:t>
+        <w:t>Pon la clara reservada en un bol apto para microondas ligeramente engrasado. Añade 1 cda de agua o leche. Opcional: una pizca de pimentón dulce o cúrcuma para dar color. Bate hasta que espume. Añade pimienta (poca sal, el bacon y el queso ya salan). Microondas 25-30 segundos a potencia media-alta. Ve de 10 en 10 hasta que cuaje.</w:t>
       </w:r>
     </w:p>
     <w:p>
@@ -431,7 +431,7 @@
     </w:p>
     <w:p>
       <w:r>
-        <w:t>Sirve la carbonara en un plato hondo. Espolvorea más pimienta negra por encima. Acompaña con la microtortilla de clara al lado o encima. ¡Listo en 15 minutos!</w:t>
+        <w:t>Sirve la carbonara en un plato hondo. Espolvorea más pimienta negra por encima. Acompaña con la microtortilla al lado. ¡Listo en 15 minutos!</w:t>
       </w:r>
     </w:p>
     <w:p>
@@ -457,7 +457,7 @@
     </w:p>
     <w:p>
       <w:r>
-        <w:t>Añadir más agua de cocción (hasta 100 ml) y la nuez de mantequilla. O usar solo yemas (3 yemas, sin clara) para una salsa más rica.</w:t>
+        <w:t>Añadir más agua de cocción (hasta 100 ml) y la nuez de mantequilla. O usar solo yemas (3 yemas, sin clara).</w:t>
       </w:r>
     </w:p>
     <w:p>
@@ -470,7 +470,7 @@
     </w:p>
     <w:p>
       <w:r>
-        <w:t>Usar menos agua de cocción (1-2 cdas). La salsa debe recubrir la pasta, no bañarla.</w:t>
+        <w:t>Usar menos agua de cocción (1-2 cdas). La salsa debe recubrir, no bañar.</w:t>
       </w:r>
     </w:p>
     <w:p>
@@ -483,7 +483,7 @@
     </w:p>
     <w:p>
       <w:r>
-        <w:t>Añadir 1 cda extra de queso en polvo disuelta en 2 cdas de agua caliente antes de mezclar con la pasta.</w:t>
+        <w:t>Añadir 1 cda extra de queso en polvo disuelta en 2 cdas de agua caliente antes de mezclar.</w:t>
       </w:r>
     </w:p>
     <w:p>
@@ -496,7 +496,7 @@
     </w:p>
     <w:p>
       <w:r>
-        <w:t>Añadir una pizca de nuez moscada rallada a la mezcla de huevo.</w:t>
+        <w:t>Una pizca de nuez moscada rallada en la mezcla de huevo.</w:t>
       </w:r>
     </w:p>
     <w:p>
@@ -509,7 +509,7 @@
     </w:p>
     <w:p>
       <w:r>
-        <w:t>Se puede omitir. Aumentar el agua de cocción y emulsionar más enérgicamente.</w:t>
+        <w:t>Se puede omitir. Aumentar agua de cocción y emulsionar más enérgicamente.</w:t>
       </w:r>
     </w:p>
     <w:p>
@@ -517,25 +517,12 @@
         <w:pStyle w:val="Heading2"/>
       </w:pPr>
       <w:r>
-        <w:t>Pasta diferente</w:t>
+        <w:t>Microtortilla con mejor color</w:t>
       </w:r>
     </w:p>
     <w:p>
       <w:r>
-        <w:t>Rigatoni, penne, bucatini, fettuccine — todos funcionan. Ajustar tiempo de cocción según el formato.</w:t>
-      </w:r>
-    </w:p>
-    <w:p>
-      <w:pPr>
-        <w:pStyle w:val="Heading2"/>
-      </w:pPr>
-      <w:r>
-        <w:t>Microtortilla más esponjosa</w:t>
-      </w:r>
-    </w:p>
-    <w:p>
-      <w:r>
-        <w:t>Añadir ½ cdta de levadura química (tipo Royal) a la clara batida.</w:t>
+        <w:t>Añadir una pizca de pimentón dulce o cúrcuma a la mezcla antes de microondas. La clara sola queda pálida; el pimentón le da un tono más apetecible.</w:t>
       </w:r>
     </w:p>
     <w:p>
@@ -548,7 +535,7 @@
     </w:p>
     <w:p>
       <w:r>
-        <w:t>En lugar de microondas, cuajar en sartén antiadherente con una gota de aceite, 1 min por lado.</w:t>
+        <w:t>En lugar de microondas, cuajar en la sartén del bacon (fuego apagado, calor residual) como un revuelto.</w:t>
       </w:r>
     </w:p>
     <w:p>
@@ -580,7 +567,7 @@
         <w:pStyle w:val="ListBullet"/>
       </w:pPr>
       <w:r>
-        <w:t>El queso en polvo emulsiona peor que el recién rallado. La mantequilla y el agua de cocción caliente compensan esa falta de grasa natural.</w:t>
+        <w:t>El queso en polvo emulsiona peor que el recién rallado. La mantequilla y el agua de cocción caliente compensan la falta de grasa natural.</w:t>
       </w:r>
     </w:p>
     <w:p>
@@ -588,7 +575,7 @@
         <w:pStyle w:val="ListBullet"/>
       </w:pPr>
       <w:r>
-        <w:t>La microtortilla también se puede comer fría al día siguiente o añadir a una ensalada.</w:t>
+        <w:t>Con bacon y queso curado, prueba antes de añadir sal extra — seguro que ya está en su punto.</w:t>
       </w:r>
     </w:p>
     <w:p>

</xml_diff>